<commit_message>
Done print preview docx ranap neonatus
</commit_message>
<xml_diff>
--- a/public/doc/emr/print_ranap_neonatus_dokter.docx
+++ b/public/doc/emr/print_ranap_neonatus_dokter.docx
@@ -161,12 +161,21 @@
               </w:rPr>
               <w:br/>
             </w:r>
+            <w:proofErr w:type="gramStart"/>
             <w:r>
               <w:rPr>
                 <w:b/>
                 <w:szCs w:val="16"/>
               </w:rPr>
-              <w:t xml:space="preserve">E-Mail : </w:t>
+              <w:t>E-Mail :</w:t>
+            </w:r>
+            <w:proofErr w:type="gramEnd"/>
+            <w:r>
+              <w:rPr>
+                <w:b/>
+                <w:szCs w:val="16"/>
+              </w:rPr>
+              <w:t xml:space="preserve"> </w:t>
             </w:r>
             <w:hyperlink r:id="rId9" w:history="1">
               <w:r>
@@ -185,7 +194,23 @@
                 <w:b/>
                 <w:szCs w:val="16"/>
               </w:rPr>
-              <w:t xml:space="preserve"> Website : </w:t>
+              <w:t xml:space="preserve"> </w:t>
+            </w:r>
+            <w:proofErr w:type="gramStart"/>
+            <w:r>
+              <w:rPr>
+                <w:b/>
+                <w:szCs w:val="16"/>
+              </w:rPr>
+              <w:t>Website :</w:t>
+            </w:r>
+            <w:proofErr w:type="gramEnd"/>
+            <w:r>
+              <w:rPr>
+                <w:b/>
+                <w:szCs w:val="16"/>
+              </w:rPr>
+              <w:t xml:space="preserve"> </w:t>
             </w:r>
             <w:hyperlink r:id="rId10" w:history="1">
               <w:r>
@@ -689,6 +714,7 @@
               </w:rPr>
             </w:pPr>
             <w:proofErr w:type="spellStart"/>
+            <w:proofErr w:type="gramStart"/>
             <w:r>
               <w:t>Tanggal</w:t>
             </w:r>
@@ -697,7 +723,11 @@
               <w:t xml:space="preserve"> </w:t>
             </w:r>
             <w:r>
-              <w:t xml:space="preserve">: </w:t>
+              <w:t>:</w:t>
+            </w:r>
+            <w:proofErr w:type="gramEnd"/>
+            <w:r>
+              <w:t xml:space="preserve"> </w:t>
             </w:r>
             <w:r>
               <w:rPr>
@@ -739,6 +769,7 @@
                 <w:lang w:val="en-ID"/>
               </w:rPr>
             </w:pPr>
+            <w:proofErr w:type="gramStart"/>
             <w:r>
               <w:t>Jam</w:t>
             </w:r>
@@ -746,7 +777,11 @@
               <w:t xml:space="preserve"> </w:t>
             </w:r>
             <w:r>
-              <w:t xml:space="preserve">: </w:t>
+              <w:t>:</w:t>
+            </w:r>
+            <w:proofErr w:type="gramEnd"/>
+            <w:r>
+              <w:t xml:space="preserve"> </w:t>
             </w:r>
             <w:r>
               <w:rPr>
@@ -773,105 +808,6 @@
                 <w:sz w:val="17"/>
               </w:rPr>
               <w:t>}</w:t>
-            </w:r>
-          </w:p>
-        </w:tc>
-      </w:tr>
-    </w:tbl>
-    <w:p/>
-    <w:tbl>
-      <w:tblPr>
-        <w:tblStyle w:val="TableGrid"/>
-        <w:tblW w:w="0" w:type="auto"/>
-        <w:tblLook w:val="04A0" w:firstRow="1" w:lastRow="0" w:firstColumn="1" w:lastColumn="0" w:noHBand="0" w:noVBand="1"/>
-      </w:tblPr>
-      <w:tblGrid>
-        <w:gridCol w:w="5653"/>
-        <w:gridCol w:w="5654"/>
-      </w:tblGrid>
-      <w:tr>
-        <w:tc>
-          <w:tcPr>
-            <w:tcW w:w="5653" w:type="dxa"/>
-          </w:tcPr>
-          <w:p>
-            <w:pPr>
-              <w:rPr>
-                <w:sz w:val="17"/>
-              </w:rPr>
-            </w:pPr>
-            <w:r>
-              <w:rPr>
-                <w:b/>
-                <w:bCs/>
-                <w:sz w:val="20"/>
-                <w:szCs w:val="20"/>
-              </w:rPr>
-              <w:t>STATUS OBSTETRI</w:t>
-            </w:r>
-          </w:p>
-        </w:tc>
-        <w:tc>
-          <w:tcPr>
-            <w:tcW w:w="5654" w:type="dxa"/>
-          </w:tcPr>
-          <w:p>
-            <w:pPr>
-              <w:rPr>
-                <w:sz w:val="17"/>
-              </w:rPr>
-            </w:pPr>
-            <w:r>
-              <w:rPr>
-                <w:b/>
-                <w:bCs/>
-                <w:sz w:val="20"/>
-                <w:szCs w:val="20"/>
-              </w:rPr>
-              <w:t xml:space="preserve">STATUS </w:t>
-            </w:r>
-            <w:r>
-              <w:rPr>
-                <w:b/>
-                <w:bCs/>
-                <w:sz w:val="20"/>
-                <w:szCs w:val="20"/>
-              </w:rPr>
-              <w:t>NEONATUS</w:t>
-            </w:r>
-          </w:p>
-        </w:tc>
-      </w:tr>
-      <w:tr>
-        <w:tc>
-          <w:tcPr>
-            <w:tcW w:w="5653" w:type="dxa"/>
-          </w:tcPr>
-          <w:p>
-            <w:r>
-              <w:t>${</w:t>
-            </w:r>
-            <w:r>
-              <w:t>STATUS_OBSTETRI</w:t>
-            </w:r>
-            <w:r>
-              <w:t>}</w:t>
-            </w:r>
-          </w:p>
-        </w:tc>
-        <w:tc>
-          <w:tcPr>
-            <w:tcW w:w="5654" w:type="dxa"/>
-          </w:tcPr>
-          <w:p>
-            <w:r>
-              <w:t>${</w:t>
-            </w:r>
-            <w:r>
-              <w:t>STATUS_</w:t>
-            </w:r>
-            <w:r>
-              <w:t>NEONATUS}</w:t>
             </w:r>
           </w:p>
         </w:tc>
@@ -893,8 +829,8 @@
       <w:tr>
         <w:tc>
           <w:tcPr>
-            <w:tcW w:w="11307" w:type="dxa"/>
-            <w:gridSpan w:val="4"/>
+            <w:tcW w:w="5653" w:type="dxa"/>
+            <w:gridSpan w:val="2"/>
           </w:tcPr>
           <w:p>
             <w:pPr>
@@ -909,25 +845,77 @@
                 <w:sz w:val="20"/>
                 <w:szCs w:val="20"/>
               </w:rPr>
-              <w:t>PENILAIAN AWAL BAYI</w:t>
-            </w:r>
-          </w:p>
-        </w:tc>
-      </w:tr>
-      <w:tr>
-        <w:tc>
-          <w:tcPr>
-            <w:tcW w:w="2826" w:type="dxa"/>
+              <w:t>STATUS OBSTETRI</w:t>
+            </w:r>
+          </w:p>
+        </w:tc>
+        <w:tc>
+          <w:tcPr>
+            <w:tcW w:w="5654" w:type="dxa"/>
+            <w:gridSpan w:val="2"/>
           </w:tcPr>
           <w:p>
             <w:pPr>
-              <w:jc w:val="center"/>
+              <w:rPr>
+                <w:sz w:val="17"/>
+              </w:rPr>
+            </w:pPr>
+            <w:r>
               <w:rPr>
                 <w:b/>
                 <w:bCs/>
                 <w:sz w:val="20"/>
                 <w:szCs w:val="20"/>
               </w:rPr>
+              <w:t>STATUS NEONATUS</w:t>
+            </w:r>
+          </w:p>
+        </w:tc>
+      </w:tr>
+      <w:tr>
+        <w:tc>
+          <w:tcPr>
+            <w:tcW w:w="5653" w:type="dxa"/>
+            <w:gridSpan w:val="2"/>
+          </w:tcPr>
+          <w:p>
+            <w:r>
+              <w:t>${</w:t>
+            </w:r>
+            <w:r>
+              <w:t>STATUS_OBSTETRI</w:t>
+            </w:r>
+            <w:r>
+              <w:t>}</w:t>
+            </w:r>
+          </w:p>
+        </w:tc>
+        <w:tc>
+          <w:tcPr>
+            <w:tcW w:w="5654" w:type="dxa"/>
+            <w:gridSpan w:val="2"/>
+          </w:tcPr>
+          <w:p>
+            <w:r>
+              <w:t>${</w:t>
+            </w:r>
+            <w:r>
+              <w:t>STATUS_NEONATUS}</w:t>
+            </w:r>
+          </w:p>
+        </w:tc>
+      </w:tr>
+      <w:tr>
+        <w:tc>
+          <w:tcPr>
+            <w:tcW w:w="11307" w:type="dxa"/>
+            <w:gridSpan w:val="4"/>
+          </w:tcPr>
+          <w:p>
+            <w:pPr>
+              <w:rPr>
+                <w:sz w:val="17"/>
+              </w:rPr>
             </w:pPr>
             <w:r>
               <w:rPr>
@@ -936,13 +924,15 @@
                 <w:sz w:val="20"/>
                 <w:szCs w:val="20"/>
               </w:rPr>
-              <w:t>APGAR SCORE</w:t>
-            </w:r>
-          </w:p>
-        </w:tc>
-        <w:tc>
-          <w:tcPr>
-            <w:tcW w:w="2827" w:type="dxa"/>
+              <w:t>PENILAIAN AWAL BAYI</w:t>
+            </w:r>
+          </w:p>
+        </w:tc>
+      </w:tr>
+      <w:tr>
+        <w:tc>
+          <w:tcPr>
+            <w:tcW w:w="2826" w:type="dxa"/>
           </w:tcPr>
           <w:p>
             <w:pPr>
@@ -961,7 +951,7 @@
                 <w:sz w:val="20"/>
                 <w:szCs w:val="20"/>
               </w:rPr>
-              <w:t>1 Menit</w:t>
+              <w:t>APGAR SCORE</w:t>
             </w:r>
           </w:p>
         </w:tc>
@@ -986,33 +976,33 @@
                 <w:sz w:val="20"/>
                 <w:szCs w:val="20"/>
               </w:rPr>
-              <w:t>5</w:t>
-            </w:r>
-            <w:r>
+              <w:t>1 Menit</w:t>
+            </w:r>
+          </w:p>
+        </w:tc>
+        <w:tc>
+          <w:tcPr>
+            <w:tcW w:w="2827" w:type="dxa"/>
+          </w:tcPr>
+          <w:p>
+            <w:pPr>
+              <w:jc w:val="center"/>
               <w:rPr>
                 <w:b/>
                 <w:bCs/>
                 <w:sz w:val="20"/>
                 <w:szCs w:val="20"/>
               </w:rPr>
-              <w:t xml:space="preserve"> Menit</w:t>
-            </w:r>
-          </w:p>
-        </w:tc>
-        <w:tc>
-          <w:tcPr>
-            <w:tcW w:w="2827" w:type="dxa"/>
-          </w:tcPr>
-          <w:p>
-            <w:pPr>
-              <w:jc w:val="center"/>
+            </w:pPr>
+            <w:r>
               <w:rPr>
                 <w:b/>
                 <w:bCs/>
                 <w:sz w:val="20"/>
                 <w:szCs w:val="20"/>
               </w:rPr>
-            </w:pPr>
+              <w:t>5</w:t>
+            </w:r>
             <w:r>
               <w:rPr>
                 <w:b/>
@@ -1020,17 +1010,24 @@
                 <w:sz w:val="20"/>
                 <w:szCs w:val="20"/>
               </w:rPr>
-              <w:t>1</w:t>
-            </w:r>
-            <w:r>
+              <w:t xml:space="preserve"> Menit</w:t>
+            </w:r>
+          </w:p>
+        </w:tc>
+        <w:tc>
+          <w:tcPr>
+            <w:tcW w:w="2827" w:type="dxa"/>
+          </w:tcPr>
+          <w:p>
+            <w:pPr>
+              <w:jc w:val="center"/>
               <w:rPr>
                 <w:b/>
                 <w:bCs/>
                 <w:sz w:val="20"/>
                 <w:szCs w:val="20"/>
               </w:rPr>
-              <w:t>0</w:t>
-            </w:r>
+            </w:pPr>
             <w:r>
               <w:rPr>
                 <w:b/>
@@ -1038,349 +1035,8 @@
                 <w:sz w:val="20"/>
                 <w:szCs w:val="20"/>
               </w:rPr>
-              <w:t xml:space="preserve"> Menit</w:t>
-            </w:r>
-          </w:p>
-        </w:tc>
-      </w:tr>
-      <w:tr>
-        <w:tc>
-          <w:tcPr>
-            <w:tcW w:w="2826" w:type="dxa"/>
-          </w:tcPr>
-          <w:p>
-            <w:proofErr w:type="spellStart"/>
-            <w:r>
-              <w:t>Denyut</w:t>
-            </w:r>
-            <w:proofErr w:type="spellEnd"/>
-            <w:r>
-              <w:t xml:space="preserve"> </w:t>
-            </w:r>
-            <w:proofErr w:type="spellStart"/>
-            <w:r>
-              <w:t>Jantung</w:t>
-            </w:r>
-            <w:proofErr w:type="spellEnd"/>
-          </w:p>
-        </w:tc>
-        <w:tc>
-          <w:tcPr>
-            <w:tcW w:w="2827" w:type="dxa"/>
-          </w:tcPr>
-          <w:p>
-            <w:pPr>
-              <w:jc w:val="center"/>
-            </w:pPr>
-            <w:r>
-              <w:t>${APGAR_1_DENYUT}</w:t>
-            </w:r>
-          </w:p>
-        </w:tc>
-        <w:tc>
-          <w:tcPr>
-            <w:tcW w:w="2827" w:type="dxa"/>
-          </w:tcPr>
-          <w:p>
-            <w:pPr>
-              <w:jc w:val="center"/>
-            </w:pPr>
-            <w:r>
-              <w:t>${APGAR_</w:t>
-            </w:r>
-            <w:r>
-              <w:t>5</w:t>
-            </w:r>
-            <w:r>
-              <w:t>_DENYUT}</w:t>
-            </w:r>
-          </w:p>
-        </w:tc>
-        <w:tc>
-          <w:tcPr>
-            <w:tcW w:w="2827" w:type="dxa"/>
-          </w:tcPr>
-          <w:p>
-            <w:pPr>
-              <w:jc w:val="center"/>
-            </w:pPr>
-            <w:r>
-              <w:t>${APGAR_1</w:t>
-            </w:r>
-            <w:r>
-              <w:t>0</w:t>
-            </w:r>
-            <w:r>
-              <w:t>_DENYUT}</w:t>
-            </w:r>
-          </w:p>
-        </w:tc>
-      </w:tr>
-      <w:tr>
-        <w:tc>
-          <w:tcPr>
-            <w:tcW w:w="2826" w:type="dxa"/>
-          </w:tcPr>
-          <w:p>
-            <w:proofErr w:type="spellStart"/>
-            <w:r>
-              <w:t>Pernapasan</w:t>
-            </w:r>
-            <w:proofErr w:type="spellEnd"/>
-          </w:p>
-        </w:tc>
-        <w:tc>
-          <w:tcPr>
-            <w:tcW w:w="2827" w:type="dxa"/>
-          </w:tcPr>
-          <w:p>
-            <w:pPr>
-              <w:jc w:val="center"/>
-            </w:pPr>
-            <w:r>
-              <w:t>${APGAR_1_PERNAFASAN}</w:t>
-            </w:r>
-          </w:p>
-        </w:tc>
-        <w:tc>
-          <w:tcPr>
-            <w:tcW w:w="2827" w:type="dxa"/>
-          </w:tcPr>
-          <w:p>
-            <w:pPr>
-              <w:jc w:val="center"/>
-            </w:pPr>
-            <w:r>
-              <w:t>${APGAR_</w:t>
-            </w:r>
-            <w:r>
-              <w:t>5</w:t>
-            </w:r>
-            <w:r>
-              <w:t>_PERNAFASAN}</w:t>
-            </w:r>
-          </w:p>
-        </w:tc>
-        <w:tc>
-          <w:tcPr>
-            <w:tcW w:w="2827" w:type="dxa"/>
-          </w:tcPr>
-          <w:p>
-            <w:pPr>
-              <w:jc w:val="center"/>
-            </w:pPr>
-            <w:r>
-              <w:t>${APGAR_1</w:t>
-            </w:r>
-            <w:r>
-              <w:t>0</w:t>
-            </w:r>
-            <w:r>
-              <w:t>_PERNAFASAN}</w:t>
-            </w:r>
-          </w:p>
-        </w:tc>
-      </w:tr>
-      <w:tr>
-        <w:tc>
-          <w:tcPr>
-            <w:tcW w:w="2826" w:type="dxa"/>
-          </w:tcPr>
-          <w:p>
-            <w:r>
-              <w:t>Tonus Otot</w:t>
-            </w:r>
-          </w:p>
-        </w:tc>
-        <w:tc>
-          <w:tcPr>
-            <w:tcW w:w="2827" w:type="dxa"/>
-          </w:tcPr>
-          <w:p>
-            <w:pPr>
-              <w:jc w:val="center"/>
-            </w:pPr>
-            <w:r>
-              <w:t>${APGAR_1_TONUS}</w:t>
-            </w:r>
-          </w:p>
-        </w:tc>
-        <w:tc>
-          <w:tcPr>
-            <w:tcW w:w="2827" w:type="dxa"/>
-          </w:tcPr>
-          <w:p>
-            <w:pPr>
-              <w:jc w:val="center"/>
-            </w:pPr>
-            <w:r>
-              <w:t>${APGAR_</w:t>
-            </w:r>
-            <w:r>
-              <w:t>5</w:t>
-            </w:r>
-            <w:r>
-              <w:t>_TONUS}</w:t>
-            </w:r>
-          </w:p>
-        </w:tc>
-        <w:tc>
-          <w:tcPr>
-            <w:tcW w:w="2827" w:type="dxa"/>
-          </w:tcPr>
-          <w:p>
-            <w:pPr>
-              <w:jc w:val="center"/>
-            </w:pPr>
-            <w:r>
-              <w:t>${APGAR_1</w:t>
-            </w:r>
-            <w:r>
-              <w:t>0</w:t>
-            </w:r>
-            <w:r>
-              <w:t>_TONUS}</w:t>
-            </w:r>
-          </w:p>
-        </w:tc>
-      </w:tr>
-      <w:tr>
-        <w:tc>
-          <w:tcPr>
-            <w:tcW w:w="2826" w:type="dxa"/>
-          </w:tcPr>
-          <w:p>
-            <w:r>
-              <w:t xml:space="preserve">Peka </w:t>
-            </w:r>
-            <w:proofErr w:type="spellStart"/>
-            <w:r>
-              <w:t>Rangsang</w:t>
-            </w:r>
-            <w:proofErr w:type="spellEnd"/>
-          </w:p>
-        </w:tc>
-        <w:tc>
-          <w:tcPr>
-            <w:tcW w:w="2827" w:type="dxa"/>
-          </w:tcPr>
-          <w:p>
-            <w:pPr>
-              <w:jc w:val="center"/>
-            </w:pPr>
-            <w:r>
-              <w:t>${APGAR_1_RANGSANG}</w:t>
-            </w:r>
-          </w:p>
-        </w:tc>
-        <w:tc>
-          <w:tcPr>
-            <w:tcW w:w="2827" w:type="dxa"/>
-          </w:tcPr>
-          <w:p>
-            <w:pPr>
-              <w:jc w:val="center"/>
-            </w:pPr>
-            <w:r>
-              <w:t>${APGAR_</w:t>
-            </w:r>
-            <w:r>
-              <w:t>5</w:t>
-            </w:r>
-            <w:r>
-              <w:t>_RANGSANG}</w:t>
-            </w:r>
-          </w:p>
-        </w:tc>
-        <w:tc>
-          <w:tcPr>
-            <w:tcW w:w="2827" w:type="dxa"/>
-          </w:tcPr>
-          <w:p>
-            <w:pPr>
-              <w:jc w:val="center"/>
-            </w:pPr>
-            <w:r>
-              <w:t>${APGAR_1</w:t>
-            </w:r>
-            <w:r>
-              <w:t>0</w:t>
-            </w:r>
-            <w:r>
-              <w:t>_RANGSANG}</w:t>
-            </w:r>
-          </w:p>
-        </w:tc>
-      </w:tr>
-      <w:tr>
-        <w:tc>
-          <w:tcPr>
-            <w:tcW w:w="2826" w:type="dxa"/>
-          </w:tcPr>
-          <w:p>
-            <w:r>
-              <w:t>Warna</w:t>
-            </w:r>
-          </w:p>
-        </w:tc>
-        <w:tc>
-          <w:tcPr>
-            <w:tcW w:w="2827" w:type="dxa"/>
-          </w:tcPr>
-          <w:p>
-            <w:pPr>
-              <w:jc w:val="center"/>
-            </w:pPr>
-            <w:r>
-              <w:t>${APGAR_1_WARNA}</w:t>
-            </w:r>
-          </w:p>
-        </w:tc>
-        <w:tc>
-          <w:tcPr>
-            <w:tcW w:w="2827" w:type="dxa"/>
-          </w:tcPr>
-          <w:p>
-            <w:pPr>
-              <w:jc w:val="center"/>
-            </w:pPr>
-            <w:r>
-              <w:t>${APGAR_</w:t>
-            </w:r>
-            <w:r>
-              <w:t>5</w:t>
-            </w:r>
-            <w:r>
-              <w:t>_WARNA}</w:t>
-            </w:r>
-          </w:p>
-        </w:tc>
-        <w:tc>
-          <w:tcPr>
-            <w:tcW w:w="2827" w:type="dxa"/>
-          </w:tcPr>
-          <w:p>
-            <w:pPr>
-              <w:jc w:val="center"/>
-            </w:pPr>
-            <w:r>
-              <w:t>${APGAR_1</w:t>
-            </w:r>
-            <w:r>
-              <w:t>0</w:t>
-            </w:r>
-            <w:r>
-              <w:t>_WARNA}</w:t>
-            </w:r>
-          </w:p>
-        </w:tc>
-      </w:tr>
-      <w:tr>
-        <w:tc>
-          <w:tcPr>
-            <w:tcW w:w="2826" w:type="dxa"/>
-          </w:tcPr>
-          <w:p>
+              <w:t>1</w:t>
+            </w:r>
             <w:r>
               <w:rPr>
                 <w:b/>
@@ -1388,8 +1044,39 @@
                 <w:sz w:val="20"/>
                 <w:szCs w:val="20"/>
               </w:rPr>
-              <w:t>TOTAL</w:t>
-            </w:r>
+              <w:t>0</w:t>
+            </w:r>
+            <w:r>
+              <w:rPr>
+                <w:b/>
+                <w:bCs/>
+                <w:sz w:val="20"/>
+                <w:szCs w:val="20"/>
+              </w:rPr>
+              <w:t xml:space="preserve"> Menit</w:t>
+            </w:r>
+          </w:p>
+        </w:tc>
+      </w:tr>
+      <w:tr>
+        <w:tc>
+          <w:tcPr>
+            <w:tcW w:w="2826" w:type="dxa"/>
+          </w:tcPr>
+          <w:p>
+            <w:proofErr w:type="spellStart"/>
+            <w:r>
+              <w:t>Denyut</w:t>
+            </w:r>
+            <w:proofErr w:type="spellEnd"/>
+            <w:r>
+              <w:t xml:space="preserve"> </w:t>
+            </w:r>
+            <w:proofErr w:type="spellStart"/>
+            <w:r>
+              <w:t>Jantung</w:t>
+            </w:r>
+            <w:proofErr w:type="spellEnd"/>
           </w:p>
         </w:tc>
         <w:tc>
@@ -1401,7 +1088,7 @@
               <w:jc w:val="center"/>
             </w:pPr>
             <w:r>
-              <w:t>${APGAR_TOTAL_1}</w:t>
+              <w:t>${APGAR_1_DENYUT}</w:t>
             </w:r>
           </w:p>
         </w:tc>
@@ -1414,13 +1101,13 @@
               <w:jc w:val="center"/>
             </w:pPr>
             <w:r>
-              <w:t>${APGAR_TOTAL_</w:t>
+              <w:t>${APGAR_</w:t>
             </w:r>
             <w:r>
               <w:t>5</w:t>
             </w:r>
             <w:r>
-              <w:t>}</w:t>
+              <w:t>_DENYUT}</w:t>
             </w:r>
           </w:p>
         </w:tc>
@@ -1433,12 +1120,380 @@
               <w:jc w:val="center"/>
             </w:pPr>
             <w:r>
+              <w:t>${APGAR_1</w:t>
+            </w:r>
+            <w:r>
+              <w:t>0</w:t>
+            </w:r>
+            <w:r>
+              <w:t>_DENYUT}</w:t>
+            </w:r>
+          </w:p>
+        </w:tc>
+      </w:tr>
+      <w:tr>
+        <w:tc>
+          <w:tcPr>
+            <w:tcW w:w="2826" w:type="dxa"/>
+          </w:tcPr>
+          <w:p>
+            <w:proofErr w:type="spellStart"/>
+            <w:r>
+              <w:t>Pernapasan</w:t>
+            </w:r>
+            <w:proofErr w:type="spellEnd"/>
+          </w:p>
+        </w:tc>
+        <w:tc>
+          <w:tcPr>
+            <w:tcW w:w="2827" w:type="dxa"/>
+          </w:tcPr>
+          <w:p>
+            <w:pPr>
+              <w:jc w:val="center"/>
+            </w:pPr>
+            <w:r>
+              <w:t>${APGAR_1_PERNAFASAN}</w:t>
+            </w:r>
+          </w:p>
+        </w:tc>
+        <w:tc>
+          <w:tcPr>
+            <w:tcW w:w="2827" w:type="dxa"/>
+          </w:tcPr>
+          <w:p>
+            <w:pPr>
+              <w:jc w:val="center"/>
+            </w:pPr>
+            <w:r>
+              <w:t>${APGAR_</w:t>
+            </w:r>
+            <w:r>
+              <w:t>5</w:t>
+            </w:r>
+            <w:r>
+              <w:t>_PERNAFASAN}</w:t>
+            </w:r>
+          </w:p>
+        </w:tc>
+        <w:tc>
+          <w:tcPr>
+            <w:tcW w:w="2827" w:type="dxa"/>
+          </w:tcPr>
+          <w:p>
+            <w:pPr>
+              <w:jc w:val="center"/>
+            </w:pPr>
+            <w:r>
+              <w:t>${APGAR_1</w:t>
+            </w:r>
+            <w:r>
+              <w:t>0</w:t>
+            </w:r>
+            <w:r>
+              <w:t>_PERNAFASAN}</w:t>
+            </w:r>
+          </w:p>
+        </w:tc>
+      </w:tr>
+      <w:tr>
+        <w:tc>
+          <w:tcPr>
+            <w:tcW w:w="2826" w:type="dxa"/>
+          </w:tcPr>
+          <w:p>
+            <w:r>
+              <w:t>Tonus Otot</w:t>
+            </w:r>
+          </w:p>
+        </w:tc>
+        <w:tc>
+          <w:tcPr>
+            <w:tcW w:w="2827" w:type="dxa"/>
+          </w:tcPr>
+          <w:p>
+            <w:pPr>
+              <w:jc w:val="center"/>
+            </w:pPr>
+            <w:r>
+              <w:t>${APGAR_1_TONUS}</w:t>
+            </w:r>
+          </w:p>
+        </w:tc>
+        <w:tc>
+          <w:tcPr>
+            <w:tcW w:w="2827" w:type="dxa"/>
+          </w:tcPr>
+          <w:p>
+            <w:pPr>
+              <w:jc w:val="center"/>
+            </w:pPr>
+            <w:r>
+              <w:t>${APGAR_</w:t>
+            </w:r>
+            <w:r>
+              <w:t>5</w:t>
+            </w:r>
+            <w:r>
+              <w:t>_TONUS}</w:t>
+            </w:r>
+          </w:p>
+        </w:tc>
+        <w:tc>
+          <w:tcPr>
+            <w:tcW w:w="2827" w:type="dxa"/>
+          </w:tcPr>
+          <w:p>
+            <w:pPr>
+              <w:jc w:val="center"/>
+            </w:pPr>
+            <w:r>
+              <w:t>${APGAR_1</w:t>
+            </w:r>
+            <w:r>
+              <w:t>0</w:t>
+            </w:r>
+            <w:r>
+              <w:t>_TONUS}</w:t>
+            </w:r>
+          </w:p>
+        </w:tc>
+      </w:tr>
+      <w:tr>
+        <w:tc>
+          <w:tcPr>
+            <w:tcW w:w="2826" w:type="dxa"/>
+          </w:tcPr>
+          <w:p>
+            <w:r>
+              <w:t xml:space="preserve">Peka </w:t>
+            </w:r>
+            <w:proofErr w:type="spellStart"/>
+            <w:r>
+              <w:t>Rangsang</w:t>
+            </w:r>
+            <w:proofErr w:type="spellEnd"/>
+          </w:p>
+        </w:tc>
+        <w:tc>
+          <w:tcPr>
+            <w:tcW w:w="2827" w:type="dxa"/>
+          </w:tcPr>
+          <w:p>
+            <w:pPr>
+              <w:jc w:val="center"/>
+            </w:pPr>
+            <w:r>
+              <w:t>${APGAR_1_RANGSANG}</w:t>
+            </w:r>
+          </w:p>
+        </w:tc>
+        <w:tc>
+          <w:tcPr>
+            <w:tcW w:w="2827" w:type="dxa"/>
+          </w:tcPr>
+          <w:p>
+            <w:pPr>
+              <w:jc w:val="center"/>
+            </w:pPr>
+            <w:r>
+              <w:t>${APGAR_</w:t>
+            </w:r>
+            <w:r>
+              <w:t>5</w:t>
+            </w:r>
+            <w:r>
+              <w:t>_RANGSANG}</w:t>
+            </w:r>
+          </w:p>
+        </w:tc>
+        <w:tc>
+          <w:tcPr>
+            <w:tcW w:w="2827" w:type="dxa"/>
+          </w:tcPr>
+          <w:p>
+            <w:pPr>
+              <w:jc w:val="center"/>
+            </w:pPr>
+            <w:r>
+              <w:t>${APGAR_1</w:t>
+            </w:r>
+            <w:r>
+              <w:t>0</w:t>
+            </w:r>
+            <w:r>
+              <w:t>_RANGSANG}</w:t>
+            </w:r>
+          </w:p>
+        </w:tc>
+      </w:tr>
+      <w:tr>
+        <w:tc>
+          <w:tcPr>
+            <w:tcW w:w="2826" w:type="dxa"/>
+          </w:tcPr>
+          <w:p>
+            <w:r>
+              <w:t>Warna</w:t>
+            </w:r>
+          </w:p>
+        </w:tc>
+        <w:tc>
+          <w:tcPr>
+            <w:tcW w:w="2827" w:type="dxa"/>
+          </w:tcPr>
+          <w:p>
+            <w:pPr>
+              <w:jc w:val="center"/>
+            </w:pPr>
+            <w:r>
+              <w:t>${APGAR_1_WARNA}</w:t>
+            </w:r>
+          </w:p>
+        </w:tc>
+        <w:tc>
+          <w:tcPr>
+            <w:tcW w:w="2827" w:type="dxa"/>
+          </w:tcPr>
+          <w:p>
+            <w:pPr>
+              <w:jc w:val="center"/>
+            </w:pPr>
+            <w:r>
+              <w:t>${APGAR_</w:t>
+            </w:r>
+            <w:r>
+              <w:t>5</w:t>
+            </w:r>
+            <w:r>
+              <w:t>_WARNA}</w:t>
+            </w:r>
+          </w:p>
+        </w:tc>
+        <w:tc>
+          <w:tcPr>
+            <w:tcW w:w="2827" w:type="dxa"/>
+          </w:tcPr>
+          <w:p>
+            <w:pPr>
+              <w:jc w:val="center"/>
+            </w:pPr>
+            <w:r>
+              <w:t>${APGAR_1</w:t>
+            </w:r>
+            <w:r>
+              <w:t>0</w:t>
+            </w:r>
+            <w:r>
+              <w:t>_WARNA}</w:t>
+            </w:r>
+          </w:p>
+        </w:tc>
+      </w:tr>
+      <w:tr>
+        <w:tc>
+          <w:tcPr>
+            <w:tcW w:w="2826" w:type="dxa"/>
+          </w:tcPr>
+          <w:p>
+            <w:r>
+              <w:rPr>
+                <w:b/>
+                <w:bCs/>
+                <w:sz w:val="20"/>
+                <w:szCs w:val="20"/>
+              </w:rPr>
+              <w:t>TOTAL</w:t>
+            </w:r>
+          </w:p>
+        </w:tc>
+        <w:tc>
+          <w:tcPr>
+            <w:tcW w:w="2827" w:type="dxa"/>
+          </w:tcPr>
+          <w:p>
+            <w:pPr>
+              <w:jc w:val="center"/>
+              <w:rPr>
+                <w:b/>
+                <w:bCs/>
+              </w:rPr>
+            </w:pPr>
+            <w:r>
+              <w:rPr>
+                <w:b/>
+                <w:bCs/>
+              </w:rPr>
+              <w:t>${APGAR_TOTAL_1}</w:t>
+            </w:r>
+          </w:p>
+        </w:tc>
+        <w:tc>
+          <w:tcPr>
+            <w:tcW w:w="2827" w:type="dxa"/>
+          </w:tcPr>
+          <w:p>
+            <w:pPr>
+              <w:jc w:val="center"/>
+              <w:rPr>
+                <w:b/>
+                <w:bCs/>
+              </w:rPr>
+            </w:pPr>
+            <w:r>
+              <w:rPr>
+                <w:b/>
+                <w:bCs/>
+              </w:rPr>
+              <w:t>${APGAR_TOTAL_</w:t>
+            </w:r>
+            <w:r>
+              <w:rPr>
+                <w:b/>
+                <w:bCs/>
+              </w:rPr>
+              <w:t>5</w:t>
+            </w:r>
+            <w:r>
+              <w:rPr>
+                <w:b/>
+                <w:bCs/>
+              </w:rPr>
+              <w:t>}</w:t>
+            </w:r>
+          </w:p>
+        </w:tc>
+        <w:tc>
+          <w:tcPr>
+            <w:tcW w:w="2827" w:type="dxa"/>
+          </w:tcPr>
+          <w:p>
+            <w:pPr>
+              <w:jc w:val="center"/>
+              <w:rPr>
+                <w:b/>
+                <w:bCs/>
+              </w:rPr>
+            </w:pPr>
+            <w:r>
+              <w:rPr>
+                <w:b/>
+                <w:bCs/>
+              </w:rPr>
               <w:t>${APGAR_TOTAL_1</w:t>
             </w:r>
             <w:r>
+              <w:rPr>
+                <w:b/>
+                <w:bCs/>
+              </w:rPr>
               <w:t>0</w:t>
             </w:r>
             <w:r>
+              <w:rPr>
+                <w:b/>
+                <w:bCs/>
+              </w:rPr>
               <w:t>}</w:t>
             </w:r>
           </w:p>
@@ -2465,19 +2520,24 @@
     <w:tbl>
       <w:tblPr>
         <w:tblStyle w:val="TableGrid"/>
-        <w:tblW w:w="0" w:type="auto"/>
+        <w:tblW w:w="11307" w:type="dxa"/>
         <w:tblLook w:val="04A0" w:firstRow="1" w:lastRow="0" w:firstColumn="1" w:lastColumn="0" w:noHBand="0" w:noVBand="1"/>
       </w:tblPr>
       <w:tblGrid>
-        <w:gridCol w:w="2802"/>
+        <w:gridCol w:w="1951"/>
         <w:gridCol w:w="283"/>
-        <w:gridCol w:w="8222"/>
+        <w:gridCol w:w="1535"/>
+        <w:gridCol w:w="1868"/>
+        <w:gridCol w:w="1901"/>
+        <w:gridCol w:w="49"/>
+        <w:gridCol w:w="283"/>
+        <w:gridCol w:w="3437"/>
       </w:tblGrid>
       <w:tr>
         <w:tc>
           <w:tcPr>
             <w:tcW w:w="11307" w:type="dxa"/>
-            <w:gridSpan w:val="3"/>
+            <w:gridSpan w:val="8"/>
           </w:tcPr>
           <w:p>
             <w:pPr>
@@ -2495,65 +2555,58 @@
               </w:rPr>
               <w:t>PEMERIKSAAN FISIK</w:t>
             </w:r>
+            <w:r>
+              <w:rPr>
+                <w:b/>
+                <w:bCs/>
+                <w:sz w:val="20"/>
+                <w:szCs w:val="20"/>
+              </w:rPr>
+              <w:t xml:space="preserve"> NEONATUS</w:t>
+            </w:r>
           </w:p>
         </w:tc>
       </w:tr>
       <w:tr>
         <w:tc>
           <w:tcPr>
-            <w:tcW w:w="2802" w:type="dxa"/>
-          </w:tcPr>
-          <w:p>
-            <w:r>
-              <w:t>Mata</w:t>
-            </w:r>
-          </w:p>
-        </w:tc>
-        <w:tc>
-          <w:tcPr>
-            <w:tcW w:w="283" w:type="dxa"/>
-          </w:tcPr>
-          <w:p>
-            <w:r>
-              <w:t>:</w:t>
-            </w:r>
-          </w:p>
-        </w:tc>
-        <w:tc>
-          <w:tcPr>
-            <w:tcW w:w="8222" w:type="dxa"/>
+            <w:tcW w:w="11307" w:type="dxa"/>
+            <w:gridSpan w:val="8"/>
           </w:tcPr>
           <w:p>
             <w:pPr>
               <w:rPr>
-                <w:sz w:val="17"/>
+                <w:b/>
+                <w:bCs/>
+                <w:sz w:val="20"/>
+                <w:szCs w:val="20"/>
               </w:rPr>
             </w:pPr>
-            <w:r>
-              <w:t>${PF_MATA}</w:t>
-            </w:r>
+            <w:proofErr w:type="spellStart"/>
+            <w:r>
+              <w:rPr>
+                <w:b/>
+                <w:bCs/>
+                <w:sz w:val="20"/>
+                <w:szCs w:val="20"/>
+              </w:rPr>
+              <w:t>Kepala</w:t>
+            </w:r>
+            <w:proofErr w:type="spellEnd"/>
           </w:p>
         </w:tc>
       </w:tr>
       <w:tr>
         <w:tc>
           <w:tcPr>
-            <w:tcW w:w="2802" w:type="dxa"/>
+            <w:tcW w:w="1951" w:type="dxa"/>
           </w:tcPr>
           <w:p>
             <w:proofErr w:type="spellStart"/>
             <w:r>
-              <w:t>Mulut</w:t>
+              <w:t>Bentuk</w:t>
             </w:r>
             <w:proofErr w:type="spellEnd"/>
-            <w:r>
-              <w:t xml:space="preserve"> / </w:t>
-            </w:r>
-            <w:proofErr w:type="spellStart"/>
-            <w:r>
-              <w:t>tenggorokan</w:t>
-            </w:r>
-            <w:proofErr w:type="spellEnd"/>
           </w:p>
         </w:tc>
         <w:tc>
@@ -2568,16 +2621,93 @@
         </w:tc>
         <w:tc>
           <w:tcPr>
-            <w:tcW w:w="8222" w:type="dxa"/>
+            <w:tcW w:w="3403" w:type="dxa"/>
+            <w:gridSpan w:val="2"/>
           </w:tcPr>
           <w:p>
             <w:pPr>
               <w:rPr>
+                <w:lang w:val="en-ID"/>
+              </w:rPr>
+            </w:pPr>
+            <w:r>
+              <w:t>${</w:t>
+            </w:r>
+            <w:r>
+              <w:rPr>
+                <w:lang w:val="en-ID"/>
+              </w:rPr>
+              <w:t>PFN_BENTUK</w:t>
+            </w:r>
+            <w:r>
+              <w:t>}</w:t>
+            </w:r>
+          </w:p>
+        </w:tc>
+        <w:tc>
+          <w:tcPr>
+            <w:tcW w:w="1950" w:type="dxa"/>
+            <w:gridSpan w:val="2"/>
+          </w:tcPr>
+          <w:p>
+            <w:pPr>
+              <w:rPr>
                 <w:sz w:val="17"/>
               </w:rPr>
             </w:pPr>
             <w:r>
-              <w:t>${PF_MULUT_TENGGOROKAN}</w:t>
+              <w:rPr>
+                <w:sz w:val="17"/>
+              </w:rPr>
+              <w:t>Suturae</w:t>
+            </w:r>
+          </w:p>
+        </w:tc>
+        <w:tc>
+          <w:tcPr>
+            <w:tcW w:w="283" w:type="dxa"/>
+          </w:tcPr>
+          <w:p>
+            <w:pPr>
+              <w:rPr>
+                <w:sz w:val="17"/>
+              </w:rPr>
+            </w:pPr>
+            <w:r>
+              <w:rPr>
+                <w:sz w:val="17"/>
+              </w:rPr>
+              <w:t>:</w:t>
+            </w:r>
+          </w:p>
+        </w:tc>
+        <w:tc>
+          <w:tcPr>
+            <w:tcW w:w="3437" w:type="dxa"/>
+          </w:tcPr>
+          <w:p>
+            <w:pPr>
+              <w:rPr>
+                <w:sz w:val="17"/>
+              </w:rPr>
+            </w:pPr>
+            <w:r>
+              <w:t>${</w:t>
+            </w:r>
+            <w:r>
+              <w:rPr>
+                <w:lang w:val="en-ID"/>
+              </w:rPr>
+              <w:t>PFN_</w:t>
+            </w:r>
+            <w:r>
+              <w:rPr>
+                <w:lang w:val="en-ID"/>
+              </w:rPr>
+              <w:t>SUTURAE</w:t>
+            </w:r>
+            <w:r>
+              <w:t>}</w:t>
             </w:r>
           </w:p>
         </w:tc>
@@ -2585,11 +2715,11 @@
       <w:tr>
         <w:tc>
           <w:tcPr>
-            <w:tcW w:w="2802" w:type="dxa"/>
-          </w:tcPr>
-          <w:p>
-            <w:r>
-              <w:t>Leher</w:t>
+            <w:tcW w:w="1951" w:type="dxa"/>
+          </w:tcPr>
+          <w:p>
+            <w:r>
+              <w:t>Fontanella</w:t>
             </w:r>
           </w:p>
         </w:tc>
@@ -2605,7 +2735,8 @@
         </w:tc>
         <w:tc>
           <w:tcPr>
-            <w:tcW w:w="8222" w:type="dxa"/>
+            <w:tcW w:w="3403" w:type="dxa"/>
+            <w:gridSpan w:val="2"/>
           </w:tcPr>
           <w:p>
             <w:pPr>
@@ -2614,7 +2745,74 @@
               </w:rPr>
             </w:pPr>
             <w:r>
-              <w:t>${PF_LEHER}</w:t>
+              <w:t>${PF</w:t>
+            </w:r>
+            <w:r>
+              <w:t>N_FONTANELLA</w:t>
+            </w:r>
+            <w:r>
+              <w:t>}</w:t>
+            </w:r>
+          </w:p>
+        </w:tc>
+        <w:tc>
+          <w:tcPr>
+            <w:tcW w:w="1950" w:type="dxa"/>
+            <w:gridSpan w:val="2"/>
+          </w:tcPr>
+          <w:p>
+            <w:pPr>
+              <w:rPr>
+                <w:sz w:val="17"/>
+              </w:rPr>
+            </w:pPr>
+            <w:r>
+              <w:rPr>
+                <w:sz w:val="17"/>
+              </w:rPr>
+              <w:t>Mata</w:t>
+            </w:r>
+          </w:p>
+        </w:tc>
+        <w:tc>
+          <w:tcPr>
+            <w:tcW w:w="283" w:type="dxa"/>
+          </w:tcPr>
+          <w:p>
+            <w:pPr>
+              <w:rPr>
+                <w:sz w:val="17"/>
+              </w:rPr>
+            </w:pPr>
+            <w:r>
+              <w:rPr>
+                <w:sz w:val="17"/>
+              </w:rPr>
+              <w:t>:</w:t>
+            </w:r>
+          </w:p>
+        </w:tc>
+        <w:tc>
+          <w:tcPr>
+            <w:tcW w:w="3437" w:type="dxa"/>
+          </w:tcPr>
+          <w:p>
+            <w:pPr>
+              <w:rPr>
+                <w:sz w:val="17"/>
+              </w:rPr>
+            </w:pPr>
+            <w:r>
+              <w:t>${PF</w:t>
+            </w:r>
+            <w:r>
+              <w:t>N_</w:t>
+            </w:r>
+            <w:r>
+              <w:t>MATA</w:t>
+            </w:r>
+            <w:r>
+              <w:t>}</w:t>
             </w:r>
           </w:p>
         </w:tc>
@@ -2622,15 +2820,12 @@
       <w:tr>
         <w:tc>
           <w:tcPr>
-            <w:tcW w:w="2802" w:type="dxa"/>
-          </w:tcPr>
-          <w:p>
-            <w:r>
-              <w:t xml:space="preserve">Dada / </w:t>
-            </w:r>
+            <w:tcW w:w="1951" w:type="dxa"/>
+          </w:tcPr>
+          <w:p>
             <w:proofErr w:type="spellStart"/>
             <w:r>
-              <w:t>thoraks</w:t>
+              <w:t>Hidung</w:t>
             </w:r>
             <w:proofErr w:type="spellEnd"/>
           </w:p>
@@ -2647,7 +2842,8 @@
         </w:tc>
         <w:tc>
           <w:tcPr>
-            <w:tcW w:w="8222" w:type="dxa"/>
+            <w:tcW w:w="3403" w:type="dxa"/>
+            <w:gridSpan w:val="2"/>
           </w:tcPr>
           <w:p>
             <w:pPr>
@@ -2656,7 +2852,86 @@
               </w:rPr>
             </w:pPr>
             <w:r>
-              <w:t>${PF_DADA}</w:t>
+              <w:t>${PF</w:t>
+            </w:r>
+            <w:r>
+              <w:t>N</w:t>
+            </w:r>
+            <w:r>
+              <w:t>_</w:t>
+            </w:r>
+            <w:r>
+              <w:t>HIDUNG</w:t>
+            </w:r>
+            <w:r>
+              <w:t>}</w:t>
+            </w:r>
+          </w:p>
+        </w:tc>
+        <w:tc>
+          <w:tcPr>
+            <w:tcW w:w="1950" w:type="dxa"/>
+            <w:gridSpan w:val="2"/>
+          </w:tcPr>
+          <w:p>
+            <w:pPr>
+              <w:rPr>
+                <w:sz w:val="17"/>
+              </w:rPr>
+            </w:pPr>
+            <w:r>
+              <w:rPr>
+                <w:sz w:val="17"/>
+              </w:rPr>
+              <w:t>Caput Succedaneum</w:t>
+            </w:r>
+          </w:p>
+        </w:tc>
+        <w:tc>
+          <w:tcPr>
+            <w:tcW w:w="283" w:type="dxa"/>
+          </w:tcPr>
+          <w:p>
+            <w:pPr>
+              <w:rPr>
+                <w:sz w:val="17"/>
+              </w:rPr>
+            </w:pPr>
+            <w:r>
+              <w:rPr>
+                <w:sz w:val="17"/>
+              </w:rPr>
+              <w:t>:</w:t>
+            </w:r>
+          </w:p>
+        </w:tc>
+        <w:tc>
+          <w:tcPr>
+            <w:tcW w:w="3437" w:type="dxa"/>
+          </w:tcPr>
+          <w:p>
+            <w:pPr>
+              <w:rPr>
+                <w:sz w:val="17"/>
+              </w:rPr>
+            </w:pPr>
+            <w:r>
+              <w:t>${</w:t>
+            </w:r>
+            <w:r>
+              <w:rPr>
+                <w:lang w:val="en-ID"/>
+              </w:rPr>
+              <w:t>PFN_</w:t>
+            </w:r>
+            <w:r>
+              <w:rPr>
+                <w:lang w:val="en-ID"/>
+              </w:rPr>
+              <w:t>CAPUT_SUCCEDANEUM</w:t>
+            </w:r>
+            <w:r>
+              <w:t>}</w:t>
             </w:r>
           </w:p>
         </w:tc>
@@ -2664,17 +2939,22 @@
       <w:tr>
         <w:tc>
           <w:tcPr>
-            <w:tcW w:w="2802" w:type="dxa"/>
+            <w:tcW w:w="1951" w:type="dxa"/>
           </w:tcPr>
           <w:p>
             <w:proofErr w:type="spellStart"/>
             <w:r>
-              <w:t>Jantung</w:t>
+              <w:t>Cephal</w:t>
             </w:r>
             <w:proofErr w:type="spellEnd"/>
             <w:r>
-              <w:t xml:space="preserve"> (Cor)</w:t>
-            </w:r>
+              <w:t xml:space="preserve"> </w:t>
+            </w:r>
+            <w:proofErr w:type="spellStart"/>
+            <w:r>
+              <w:t>Hematom</w:t>
+            </w:r>
+            <w:proofErr w:type="spellEnd"/>
           </w:p>
         </w:tc>
         <w:tc>
@@ -2689,7 +2969,8 @@
         </w:tc>
         <w:tc>
           <w:tcPr>
-            <w:tcW w:w="8222" w:type="dxa"/>
+            <w:tcW w:w="3403" w:type="dxa"/>
+            <w:gridSpan w:val="2"/>
           </w:tcPr>
           <w:p>
             <w:pPr>
@@ -2698,7 +2979,82 @@
               </w:rPr>
             </w:pPr>
             <w:r>
-              <w:t>${PF_COR}</w:t>
+              <w:t>${PF</w:t>
+            </w:r>
+            <w:r>
+              <w:t>N</w:t>
+            </w:r>
+            <w:r>
+              <w:t>_</w:t>
+            </w:r>
+            <w:r>
+              <w:t>CEPHAL_HEMATOM</w:t>
+            </w:r>
+            <w:r>
+              <w:t>}</w:t>
+            </w:r>
+          </w:p>
+        </w:tc>
+        <w:tc>
+          <w:tcPr>
+            <w:tcW w:w="1950" w:type="dxa"/>
+            <w:gridSpan w:val="2"/>
+          </w:tcPr>
+          <w:p>
+            <w:pPr>
+              <w:rPr>
+                <w:sz w:val="17"/>
+              </w:rPr>
+            </w:pPr>
+            <w:proofErr w:type="spellStart"/>
+            <w:r>
+              <w:rPr>
+                <w:sz w:val="17"/>
+              </w:rPr>
+              <w:t>Telinga</w:t>
+            </w:r>
+            <w:proofErr w:type="spellEnd"/>
+          </w:p>
+        </w:tc>
+        <w:tc>
+          <w:tcPr>
+            <w:tcW w:w="283" w:type="dxa"/>
+          </w:tcPr>
+          <w:p>
+            <w:pPr>
+              <w:rPr>
+                <w:sz w:val="17"/>
+              </w:rPr>
+            </w:pPr>
+            <w:r>
+              <w:rPr>
+                <w:sz w:val="17"/>
+              </w:rPr>
+              <w:t>:</w:t>
+            </w:r>
+          </w:p>
+        </w:tc>
+        <w:tc>
+          <w:tcPr>
+            <w:tcW w:w="3437" w:type="dxa"/>
+          </w:tcPr>
+          <w:p>
+            <w:pPr>
+              <w:rPr>
+                <w:sz w:val="17"/>
+              </w:rPr>
+            </w:pPr>
+            <w:r>
+              <w:t>${PF</w:t>
+            </w:r>
+            <w:r>
+              <w:t>N_</w:t>
+            </w:r>
+            <w:r>
+              <w:t>TELINGA</w:t>
+            </w:r>
+            <w:r>
+              <w:t>}</w:t>
             </w:r>
           </w:p>
         </w:tc>
@@ -2706,20 +3062,14 @@
       <w:tr>
         <w:tc>
           <w:tcPr>
-            <w:tcW w:w="2802" w:type="dxa"/>
-          </w:tcPr>
-          <w:p>
-            <w:r>
-              <w:t>Paru (</w:t>
-            </w:r>
+            <w:tcW w:w="1951" w:type="dxa"/>
+          </w:tcPr>
+          <w:p>
             <w:proofErr w:type="spellStart"/>
             <w:r>
-              <w:t>Pulmo</w:t>
+              <w:t>Mulut</w:t>
             </w:r>
             <w:proofErr w:type="spellEnd"/>
-            <w:r>
-              <w:t>)</w:t>
-            </w:r>
           </w:p>
         </w:tc>
         <w:tc>
@@ -2734,7 +3084,8 @@
         </w:tc>
         <w:tc>
           <w:tcPr>
-            <w:tcW w:w="8222" w:type="dxa"/>
+            <w:tcW w:w="3403" w:type="dxa"/>
+            <w:gridSpan w:val="2"/>
           </w:tcPr>
           <w:p>
             <w:pPr>
@@ -2743,7 +3094,80 @@
               </w:rPr>
             </w:pPr>
             <w:r>
-              <w:t>${PF_PULMO}</w:t>
+              <w:t>${PF</w:t>
+            </w:r>
+            <w:r>
+              <w:t>N</w:t>
+            </w:r>
+            <w:r>
+              <w:t>_</w:t>
+            </w:r>
+            <w:r>
+              <w:t>MULUT</w:t>
+            </w:r>
+            <w:r>
+              <w:t>}</w:t>
+            </w:r>
+          </w:p>
+        </w:tc>
+        <w:tc>
+          <w:tcPr>
+            <w:tcW w:w="1950" w:type="dxa"/>
+            <w:gridSpan w:val="2"/>
+          </w:tcPr>
+          <w:p>
+            <w:pPr>
+              <w:rPr>
+                <w:sz w:val="17"/>
+              </w:rPr>
+            </w:pPr>
+            <w:r>
+              <w:rPr>
+                <w:sz w:val="17"/>
+              </w:rPr>
+              <w:t>Leher</w:t>
+            </w:r>
+          </w:p>
+        </w:tc>
+        <w:tc>
+          <w:tcPr>
+            <w:tcW w:w="283" w:type="dxa"/>
+          </w:tcPr>
+          <w:p>
+            <w:pPr>
+              <w:rPr>
+                <w:sz w:val="17"/>
+              </w:rPr>
+            </w:pPr>
+            <w:r>
+              <w:rPr>
+                <w:sz w:val="17"/>
+              </w:rPr>
+              <w:t>:</w:t>
+            </w:r>
+          </w:p>
+        </w:tc>
+        <w:tc>
+          <w:tcPr>
+            <w:tcW w:w="3437" w:type="dxa"/>
+          </w:tcPr>
+          <w:p>
+            <w:pPr>
+              <w:rPr>
+                <w:sz w:val="17"/>
+              </w:rPr>
+            </w:pPr>
+            <w:r>
+              <w:t>${PF</w:t>
+            </w:r>
+            <w:r>
+              <w:t>N_</w:t>
+            </w:r>
+            <w:r>
+              <w:t>LEHER</w:t>
+            </w:r>
+            <w:r>
+              <w:t>}</w:t>
             </w:r>
           </w:p>
         </w:tc>
@@ -2751,66 +3175,85 @@
       <w:tr>
         <w:tc>
           <w:tcPr>
-            <w:tcW w:w="2802" w:type="dxa"/>
-          </w:tcPr>
-          <w:p>
-            <w:r>
-              <w:t>Perut / abdomen</w:t>
-            </w:r>
-          </w:p>
-        </w:tc>
-        <w:tc>
-          <w:tcPr>
-            <w:tcW w:w="283" w:type="dxa"/>
-          </w:tcPr>
-          <w:p>
-            <w:r>
-              <w:t>:</w:t>
-            </w:r>
-          </w:p>
-        </w:tc>
-        <w:tc>
-          <w:tcPr>
-            <w:tcW w:w="8222" w:type="dxa"/>
+            <w:tcW w:w="5637" w:type="dxa"/>
+            <w:gridSpan w:val="4"/>
           </w:tcPr>
           <w:p>
             <w:pPr>
               <w:rPr>
-                <w:sz w:val="17"/>
+                <w:b/>
+                <w:bCs/>
+                <w:sz w:val="20"/>
+                <w:szCs w:val="20"/>
               </w:rPr>
             </w:pPr>
             <w:r>
-              <w:t>${PF_PERUT}</w:t>
-            </w:r>
+              <w:rPr>
+                <w:b/>
+                <w:bCs/>
+                <w:sz w:val="20"/>
+                <w:szCs w:val="20"/>
+              </w:rPr>
+              <w:t>Paru</w:t>
+            </w:r>
+          </w:p>
+        </w:tc>
+        <w:tc>
+          <w:tcPr>
+            <w:tcW w:w="5670" w:type="dxa"/>
+            <w:gridSpan w:val="4"/>
+          </w:tcPr>
+          <w:p>
+            <w:pPr>
+              <w:rPr>
+                <w:b/>
+                <w:bCs/>
+                <w:sz w:val="20"/>
+                <w:szCs w:val="20"/>
+              </w:rPr>
+            </w:pPr>
+            <w:proofErr w:type="spellStart"/>
+            <w:r>
+              <w:rPr>
+                <w:b/>
+                <w:bCs/>
+                <w:sz w:val="20"/>
+                <w:szCs w:val="20"/>
+              </w:rPr>
+              <w:t>Jantung</w:t>
+            </w:r>
+            <w:proofErr w:type="spellEnd"/>
           </w:p>
         </w:tc>
       </w:tr>
       <w:tr>
         <w:tc>
           <w:tcPr>
-            <w:tcW w:w="2802" w:type="dxa"/>
-          </w:tcPr>
-          <w:p>
-            <w:proofErr w:type="spellStart"/>
-            <w:r>
-              <w:t>Ekstremitas</w:t>
-            </w:r>
-            <w:proofErr w:type="spellEnd"/>
-          </w:p>
-        </w:tc>
-        <w:tc>
-          <w:tcPr>
-            <w:tcW w:w="283" w:type="dxa"/>
-          </w:tcPr>
-          <w:p>
-            <w:r>
-              <w:t>:</w:t>
-            </w:r>
-          </w:p>
-        </w:tc>
-        <w:tc>
-          <w:tcPr>
-            <w:tcW w:w="8222" w:type="dxa"/>
+            <w:tcW w:w="5637" w:type="dxa"/>
+            <w:gridSpan w:val="4"/>
+          </w:tcPr>
+          <w:p>
+            <w:r>
+              <w:t>${PF</w:t>
+            </w:r>
+            <w:r>
+              <w:t>N</w:t>
+            </w:r>
+            <w:r>
+              <w:t>_</w:t>
+            </w:r>
+            <w:r>
+              <w:t>PARU</w:t>
+            </w:r>
+            <w:r>
+              <w:t>}</w:t>
+            </w:r>
+          </w:p>
+        </w:tc>
+        <w:tc>
+          <w:tcPr>
+            <w:tcW w:w="5670" w:type="dxa"/>
+            <w:gridSpan w:val="4"/>
           </w:tcPr>
           <w:p>
             <w:pPr>
@@ -2819,7 +3262,19 @@
               </w:rPr>
             </w:pPr>
             <w:r>
-              <w:t>${PF_EKSTREMITAS}</w:t>
+              <w:t>${PF</w:t>
+            </w:r>
+            <w:r>
+              <w:t>N</w:t>
+            </w:r>
+            <w:r>
+              <w:t>_</w:t>
+            </w:r>
+            <w:r>
+              <w:t>JANTUNG</w:t>
+            </w:r>
+            <w:r>
+              <w:t>}</w:t>
             </w:r>
           </w:p>
         </w:tc>
@@ -2827,96 +3282,461 @@
       <w:tr>
         <w:tc>
           <w:tcPr>
-            <w:tcW w:w="2802" w:type="dxa"/>
-          </w:tcPr>
-          <w:p>
-            <w:r>
-              <w:t xml:space="preserve">Status </w:t>
-            </w:r>
+            <w:tcW w:w="5637" w:type="dxa"/>
+            <w:gridSpan w:val="4"/>
+          </w:tcPr>
+          <w:p>
+            <w:pPr>
+              <w:rPr>
+                <w:b/>
+                <w:bCs/>
+                <w:sz w:val="20"/>
+                <w:szCs w:val="20"/>
+              </w:rPr>
+            </w:pPr>
+            <w:r>
+              <w:rPr>
+                <w:b/>
+                <w:bCs/>
+                <w:sz w:val="20"/>
+                <w:szCs w:val="20"/>
+              </w:rPr>
+              <w:t>Abdomen</w:t>
+            </w:r>
+          </w:p>
+        </w:tc>
+        <w:tc>
+          <w:tcPr>
+            <w:tcW w:w="5670" w:type="dxa"/>
+            <w:gridSpan w:val="4"/>
+          </w:tcPr>
+          <w:p>
+            <w:pPr>
+              <w:rPr>
+                <w:b/>
+                <w:bCs/>
+                <w:sz w:val="20"/>
+                <w:szCs w:val="20"/>
+              </w:rPr>
+            </w:pPr>
             <w:proofErr w:type="spellStart"/>
             <w:r>
-              <w:t>lokalis</w:t>
+              <w:rPr>
+                <w:b/>
+                <w:bCs/>
+                <w:sz w:val="20"/>
+                <w:szCs w:val="20"/>
+              </w:rPr>
+              <w:t>Ekstremitas</w:t>
             </w:r>
             <w:proofErr w:type="spellEnd"/>
-          </w:p>
-        </w:tc>
-        <w:tc>
-          <w:tcPr>
-            <w:tcW w:w="283" w:type="dxa"/>
-          </w:tcPr>
-          <w:p>
-            <w:r>
-              <w:t>:</w:t>
-            </w:r>
-          </w:p>
-        </w:tc>
-        <w:tc>
-          <w:tcPr>
-            <w:tcW w:w="8222" w:type="dxa"/>
-          </w:tcPr>
-          <w:p>
-            <w:pPr>
-              <w:rPr>
-                <w:sz w:val="17"/>
-              </w:rPr>
-            </w:pPr>
-            <w:r>
-              <w:t>${STATUS_LOKALIS}</w:t>
-            </w:r>
           </w:p>
         </w:tc>
       </w:tr>
       <w:tr>
         <w:tc>
           <w:tcPr>
-            <w:tcW w:w="2802" w:type="dxa"/>
-          </w:tcPr>
-          <w:p>
+            <w:tcW w:w="5637" w:type="dxa"/>
+            <w:gridSpan w:val="4"/>
+          </w:tcPr>
+          <w:p>
+            <w:r>
+              <w:t>${PF</w:t>
+            </w:r>
+            <w:r>
+              <w:t>N</w:t>
+            </w:r>
+            <w:r>
+              <w:t>_</w:t>
+            </w:r>
+            <w:r>
+              <w:t>ABDOMEN</w:t>
+            </w:r>
+            <w:r>
+              <w:t>}</w:t>
+            </w:r>
+          </w:p>
+        </w:tc>
+        <w:tc>
+          <w:tcPr>
+            <w:tcW w:w="5670" w:type="dxa"/>
+            <w:gridSpan w:val="4"/>
+          </w:tcPr>
+          <w:p>
+            <w:pPr>
+              <w:rPr>
+                <w:sz w:val="17"/>
+              </w:rPr>
+            </w:pPr>
+            <w:r>
+              <w:t>${PF</w:t>
+            </w:r>
+            <w:r>
+              <w:t>N</w:t>
+            </w:r>
+            <w:r>
+              <w:t>_</w:t>
+            </w:r>
+            <w:r>
+              <w:t>EKSTREMITAS</w:t>
+            </w:r>
+            <w:r>
+              <w:t>}</w:t>
+            </w:r>
+          </w:p>
+        </w:tc>
+      </w:tr>
+      <w:tr>
+        <w:tc>
+          <w:tcPr>
+            <w:tcW w:w="11307" w:type="dxa"/>
+            <w:gridSpan w:val="8"/>
+            <w:tcBorders>
+              <w:bottom w:val="single" w:sz="4" w:space="0" w:color="auto"/>
+            </w:tcBorders>
+          </w:tcPr>
+          <w:p>
+            <w:pPr>
+              <w:rPr>
+                <w:sz w:val="17"/>
+              </w:rPr>
+            </w:pPr>
             <w:proofErr w:type="spellStart"/>
             <w:r>
-              <w:t>Ringkasan</w:t>
+              <w:rPr>
+                <w:b/>
+                <w:bCs/>
+                <w:sz w:val="20"/>
+                <w:szCs w:val="20"/>
+              </w:rPr>
+              <w:t>Neurologi</w:t>
             </w:r>
             <w:proofErr w:type="spellEnd"/>
+          </w:p>
+        </w:tc>
+      </w:tr>
+      <w:tr>
+        <w:tc>
+          <w:tcPr>
+            <w:tcW w:w="3769" w:type="dxa"/>
+            <w:gridSpan w:val="3"/>
+            <w:tcBorders>
+              <w:bottom w:val="nil"/>
+              <w:right w:val="nil"/>
+            </w:tcBorders>
+          </w:tcPr>
+          <w:p>
+            <w:pPr>
+              <w:rPr>
+                <w:sz w:val="17"/>
+              </w:rPr>
+            </w:pPr>
+            <w:r>
+              <w:t>${PF</w:t>
+            </w:r>
+            <w:r>
+              <w:t>N</w:t>
+            </w:r>
+            <w:r>
+              <w:t>_</w:t>
+            </w:r>
+            <w:r>
+              <w:t>ROOTING</w:t>
+            </w:r>
+            <w:r>
+              <w:t>}</w:t>
+            </w:r>
+            <w:r>
+              <w:t xml:space="preserve"> Rooting</w:t>
+            </w:r>
+          </w:p>
+        </w:tc>
+        <w:tc>
+          <w:tcPr>
+            <w:tcW w:w="3769" w:type="dxa"/>
+            <w:gridSpan w:val="2"/>
+            <w:tcBorders>
+              <w:left w:val="nil"/>
+              <w:bottom w:val="nil"/>
+              <w:right w:val="nil"/>
+            </w:tcBorders>
+          </w:tcPr>
+          <w:p>
+            <w:pPr>
+              <w:rPr>
+                <w:sz w:val="17"/>
+              </w:rPr>
+            </w:pPr>
+            <w:r>
+              <w:t>${PF</w:t>
+            </w:r>
+            <w:r>
+              <w:t>N</w:t>
+            </w:r>
+            <w:r>
+              <w:t>_</w:t>
+            </w:r>
+            <w:r>
+              <w:t>SUCKING</w:t>
+            </w:r>
+            <w:r>
+              <w:t>}</w:t>
+            </w:r>
+            <w:r>
+              <w:t xml:space="preserve"> Sucking </w:t>
+            </w:r>
+            <w:proofErr w:type="gramStart"/>
+            <w:r>
+              <w:t xml:space="preserve">( </w:t>
+            </w:r>
+            <w:proofErr w:type="spellStart"/>
+            <w:r>
+              <w:t>Menghisap</w:t>
+            </w:r>
+            <w:proofErr w:type="spellEnd"/>
+            <w:proofErr w:type="gramEnd"/>
+            <w:r>
+              <w:t>)</w:t>
+            </w:r>
+          </w:p>
+        </w:tc>
+        <w:tc>
+          <w:tcPr>
+            <w:tcW w:w="3769" w:type="dxa"/>
+            <w:gridSpan w:val="3"/>
+            <w:tcBorders>
+              <w:left w:val="nil"/>
+              <w:bottom w:val="nil"/>
+            </w:tcBorders>
+          </w:tcPr>
+          <w:p>
+            <w:pPr>
+              <w:rPr>
+                <w:sz w:val="17"/>
+              </w:rPr>
+            </w:pPr>
+            <w:r>
+              <w:t>${PF</w:t>
+            </w:r>
+            <w:r>
+              <w:t>N</w:t>
+            </w:r>
+            <w:r>
+              <w:t>_</w:t>
+            </w:r>
+            <w:r>
+              <w:t>MORO</w:t>
+            </w:r>
+            <w:r>
+              <w:t>}</w:t>
+            </w:r>
             <w:r>
               <w:t xml:space="preserve"> </w:t>
             </w:r>
+            <w:r>
+              <w:t>Moro</w:t>
+            </w:r>
+          </w:p>
+        </w:tc>
+      </w:tr>
+      <w:tr>
+        <w:tc>
+          <w:tcPr>
+            <w:tcW w:w="3769" w:type="dxa"/>
+            <w:gridSpan w:val="3"/>
+            <w:tcBorders>
+              <w:top w:val="nil"/>
+              <w:right w:val="nil"/>
+            </w:tcBorders>
+          </w:tcPr>
+          <w:p>
+            <w:r>
+              <w:t>${PF</w:t>
+            </w:r>
+            <w:r>
+              <w:t>N</w:t>
+            </w:r>
+            <w:r>
+              <w:t>_</w:t>
+            </w:r>
+            <w:r>
+              <w:t>ATN</w:t>
+            </w:r>
+            <w:r>
+              <w:t>}</w:t>
+            </w:r>
+            <w:r>
+              <w:t xml:space="preserve"> </w:t>
+            </w:r>
+            <w:r>
+              <w:t>Asymmetric Tonic Neck</w:t>
+            </w:r>
+          </w:p>
+        </w:tc>
+        <w:tc>
+          <w:tcPr>
+            <w:tcW w:w="3769" w:type="dxa"/>
+            <w:gridSpan w:val="2"/>
+            <w:tcBorders>
+              <w:top w:val="nil"/>
+              <w:left w:val="nil"/>
+              <w:right w:val="nil"/>
+            </w:tcBorders>
+          </w:tcPr>
+          <w:p>
+            <w:r>
+              <w:t>${PF</w:t>
+            </w:r>
+            <w:r>
+              <w:t>N</w:t>
+            </w:r>
+            <w:r>
+              <w:t>_</w:t>
+            </w:r>
+            <w:r>
+              <w:t>BABINSKI</w:t>
+            </w:r>
+            <w:r>
+              <w:t>}</w:t>
+            </w:r>
+            <w:r>
+              <w:t xml:space="preserve"> </w:t>
+            </w:r>
+            <w:r>
+              <w:t>Babinski</w:t>
+            </w:r>
+          </w:p>
+        </w:tc>
+        <w:tc>
+          <w:tcPr>
+            <w:tcW w:w="3769" w:type="dxa"/>
+            <w:gridSpan w:val="3"/>
+            <w:tcBorders>
+              <w:top w:val="nil"/>
+              <w:left w:val="nil"/>
+            </w:tcBorders>
+          </w:tcPr>
+          <w:p>
+            <w:r>
+              <w:t>${PF</w:t>
+            </w:r>
+            <w:r>
+              <w:t>N</w:t>
+            </w:r>
+            <w:r>
+              <w:t>_</w:t>
+            </w:r>
+            <w:r>
+              <w:t>MENGGENGGAM</w:t>
+            </w:r>
+            <w:r>
+              <w:t>}</w:t>
+            </w:r>
+            <w:r>
+              <w:t xml:space="preserve"> </w:t>
+            </w:r>
             <w:proofErr w:type="spellStart"/>
             <w:r>
-              <w:t>pemeriksaan</w:t>
+              <w:t>Menggenggam</w:t>
             </w:r>
             <w:proofErr w:type="spellEnd"/>
-            <w:r>
+          </w:p>
+        </w:tc>
+      </w:tr>
+      <w:tr>
+        <w:tc>
+          <w:tcPr>
+            <w:tcW w:w="11307" w:type="dxa"/>
+            <w:gridSpan w:val="8"/>
+          </w:tcPr>
+          <w:p>
+            <w:pPr>
+              <w:rPr>
+                <w:sz w:val="17"/>
+              </w:rPr>
+            </w:pPr>
+            <w:proofErr w:type="spellStart"/>
+            <w:r>
+              <w:rPr>
+                <w:b/>
+                <w:bCs/>
+                <w:sz w:val="20"/>
+                <w:szCs w:val="20"/>
+              </w:rPr>
+              <w:t>Kulit</w:t>
+            </w:r>
+            <w:proofErr w:type="spellEnd"/>
+          </w:p>
+        </w:tc>
+      </w:tr>
+      <w:tr>
+        <w:tc>
+          <w:tcPr>
+            <w:tcW w:w="11307" w:type="dxa"/>
+            <w:gridSpan w:val="8"/>
+          </w:tcPr>
+          <w:p>
+            <w:pPr>
+              <w:rPr>
+                <w:sz w:val="17"/>
+                <w:lang w:val="en-ID"/>
+              </w:rPr>
+            </w:pPr>
+            <w:r>
+              <w:rPr>
+                <w:sz w:val="17"/>
+                <w:lang w:val="en-ID"/>
+              </w:rPr>
+              <w:t xml:space="preserve">${PFN_IKTERIK} </w:t>
+            </w:r>
+            <w:proofErr w:type="spellStart"/>
+            <w:r>
+              <w:rPr>
+                <w:sz w:val="17"/>
+                <w:lang w:val="en-ID"/>
+              </w:rPr>
+              <w:t>Ikterik</w:t>
+            </w:r>
+            <w:proofErr w:type="spellEnd"/>
+          </w:p>
+          <w:p>
+            <w:pPr>
+              <w:rPr>
+                <w:sz w:val="17"/>
+                <w:lang w:val="en-ID"/>
+              </w:rPr>
+            </w:pPr>
+            <w:proofErr w:type="spellStart"/>
+            <w:proofErr w:type="gramStart"/>
+            <w:r>
+              <w:rPr>
+                <w:sz w:val="17"/>
+                <w:lang w:val="en-ID"/>
+              </w:rPr>
+              <w:t>Keterangan</w:t>
+            </w:r>
+            <w:proofErr w:type="spellEnd"/>
+            <w:r>
+              <w:rPr>
+                <w:sz w:val="17"/>
+                <w:lang w:val="en-ID"/>
+              </w:rPr>
               <w:t xml:space="preserve"> </w:t>
             </w:r>
-            <w:proofErr w:type="spellStart"/>
-            <w:r>
-              <w:t>fisik</w:t>
-            </w:r>
-            <w:proofErr w:type="spellEnd"/>
-          </w:p>
-        </w:tc>
-        <w:tc>
-          <w:tcPr>
-            <w:tcW w:w="283" w:type="dxa"/>
-          </w:tcPr>
-          <w:p>
-            <w:r>
+            <w:r>
+              <w:rPr>
+                <w:sz w:val="17"/>
+                <w:lang w:val="en-ID"/>
+              </w:rPr>
               <w:t>:</w:t>
             </w:r>
-          </w:p>
-        </w:tc>
-        <w:tc>
-          <w:tcPr>
-            <w:tcW w:w="8222" w:type="dxa"/>
-          </w:tcPr>
-          <w:p>
-            <w:pPr>
+            <w:proofErr w:type="gramEnd"/>
+            <w:r>
               <w:rPr>
                 <w:sz w:val="17"/>
-              </w:rPr>
-            </w:pPr>
-            <w:r>
-              <w:t>${PEMERIKSAAN_FISIK}</w:t>
+                <w:lang w:val="en-ID"/>
+              </w:rPr>
+              <w:t xml:space="preserve"> ${PFN_KULIT_KETERANGAN}</w:t>
             </w:r>
           </w:p>
         </w:tc>
@@ -3136,6 +3956,7 @@
                 <w:sz w:val="20"/>
                 <w:szCs w:val="20"/>
               </w:rPr>
+              <w:lastRenderedPageBreak/>
               <w:t>TATA LAKSANA / TERAPI</w:t>
             </w:r>
           </w:p>
@@ -3210,7 +4031,6 @@
                 <w:sz w:val="20"/>
                 <w:szCs w:val="20"/>
               </w:rPr>
-              <w:lastRenderedPageBreak/>
               <w:t>RENCANA KONSULTASI</w:t>
             </w:r>
           </w:p>
@@ -3275,12 +4095,17 @@
               <w:t xml:space="preserve"> lama </w:t>
             </w:r>
             <w:proofErr w:type="spellStart"/>
+            <w:proofErr w:type="gramStart"/>
             <w:r>
               <w:t>rawat</w:t>
             </w:r>
             <w:proofErr w:type="spellEnd"/>
             <w:r>
-              <w:t xml:space="preserve"> : </w:t>
+              <w:t xml:space="preserve"> :</w:t>
+            </w:r>
+            <w:proofErr w:type="gramEnd"/>
+            <w:r>
+              <w:t xml:space="preserve"> </w:t>
             </w:r>
             <w:r>
               <w:t>${KRITERIA_PULANG}</w:t>
@@ -3293,7 +4118,14 @@
             </w:r>
             <w:r>
               <w:br/>
-              <w:t xml:space="preserve">Alasan : </w:t>
+            </w:r>
+            <w:proofErr w:type="gramStart"/>
+            <w:r>
+              <w:t>Alasan :</w:t>
+            </w:r>
+            <w:proofErr w:type="gramEnd"/>
+            <w:r>
+              <w:t xml:space="preserve"> </w:t>
             </w:r>
             <w:r>
               <w:t>${KRITERIA_PULANG_KARENA}</w:t>
@@ -3526,6 +4358,7 @@
             <w:pPr>
               <w:jc w:val="center"/>
             </w:pPr>
+            <w:proofErr w:type="gramStart"/>
             <w:r>
               <w:t xml:space="preserve">( </w:t>
             </w:r>
@@ -3533,7 +4366,14 @@
               <w:rPr>
                 <w:u w:val="single"/>
               </w:rPr>
-              <w:t>${</w:t>
+              <w:t>$</w:t>
+            </w:r>
+            <w:proofErr w:type="gramEnd"/>
+            <w:r>
+              <w:rPr>
+                <w:u w:val="single"/>
+              </w:rPr>
+              <w:t>{</w:t>
             </w:r>
             <w:r>
               <w:rPr>
@@ -3542,6 +4382,7 @@
               </w:rPr>
               <w:t>FINALISASI_OLEH</w:t>
             </w:r>
+            <w:proofErr w:type="gramStart"/>
             <w:r>
               <w:rPr>
                 <w:u w:val="single"/>
@@ -3551,6 +4392,7 @@
             <w:r>
               <w:t xml:space="preserve"> )</w:t>
             </w:r>
+            <w:proofErr w:type="gramEnd"/>
           </w:p>
           <w:p>
             <w:pPr>
@@ -4264,7 +5106,7 @@
   <w:style w:type="paragraph" w:default="1" w:styleId="Normal">
     <w:name w:val="Normal"/>
     <w:qFormat/>
-    <w:rsid w:val="00312049"/>
+    <w:rsid w:val="002816D9"/>
     <w:pPr>
       <w:spacing w:after="40"/>
     </w:pPr>
@@ -15302,6 +16144,36 @@
     <w:rsid w:val="005746FA"/>
     <w:rPr>
       <w:rFonts w:ascii="Courier New" w:eastAsia="Times New Roman" w:hAnsi="Courier New" w:cs="Courier New"/>
+      <w:sz w:val="20"/>
+      <w:szCs w:val="20"/>
+    </w:rPr>
+  </w:style>
+  <w:style w:type="paragraph" w:styleId="HTMLPreformatted">
+    <w:name w:val="HTML Preformatted"/>
+    <w:basedOn w:val="Normal"/>
+    <w:link w:val="HTMLPreformattedChar"/>
+    <w:uiPriority w:val="99"/>
+    <w:semiHidden/>
+    <w:unhideWhenUsed/>
+    <w:rsid w:val="00736C44"/>
+    <w:pPr>
+      <w:spacing w:after="0" w:line="240" w:lineRule="auto"/>
+    </w:pPr>
+    <w:rPr>
+      <w:rFonts w:ascii="Consolas" w:hAnsi="Consolas"/>
+      <w:sz w:val="20"/>
+      <w:szCs w:val="20"/>
+    </w:rPr>
+  </w:style>
+  <w:style w:type="character" w:customStyle="1" w:styleId="HTMLPreformattedChar">
+    <w:name w:val="HTML Preformatted Char"/>
+    <w:basedOn w:val="DefaultParagraphFont"/>
+    <w:link w:val="HTMLPreformatted"/>
+    <w:uiPriority w:val="99"/>
+    <w:semiHidden/>
+    <w:rsid w:val="00736C44"/>
+    <w:rPr>
+      <w:rFonts w:ascii="Consolas" w:hAnsi="Consolas"/>
       <w:sz w:val="20"/>
       <w:szCs w:val="20"/>
     </w:rPr>

</xml_diff>